<commit_message>
Point Taskify CV link to live site taskify-marketplace.co.za
</commit_message>
<xml_diff>
--- a/cv/CV_Malwandla_Hlongwane_AndroidDev.docx
+++ b/cv/CV_Malwandla_Hlongwane_AndroidDev.docx
@@ -75,7 +75,7 @@
         </w:rPr>
         <w:t xml:space="preserve">  |  </w:t>
       </w:r>
-      <w:hyperlink w:history="1" r:id="rIddeotmo6x5ztbe-q0wv_dt">
+      <w:hyperlink w:history="1" r:id="rIdlekv-wx4cjfp6h_25g86m">
         <w:r>
           <w:rPr>
             <w:rFonts w:ascii="Calibri" w:cs="Calibri" w:eastAsia="Calibri" w:hAnsi="Calibri"/>
@@ -103,7 +103,7 @@
         </w:rPr>
         <w:t xml:space="preserve">Portfolio: </w:t>
       </w:r>
-      <w:hyperlink w:history="1" r:id="rIdxjigooqhc9iqmpvd7nbz9">
+      <w:hyperlink w:history="1" r:id="rIduabwv68yvzpd_o3dr8xtf">
         <w:r>
           <w:rPr>
             <w:rFonts w:ascii="Calibri" w:cs="Calibri" w:eastAsia="Calibri" w:hAnsi="Calibri"/>
@@ -135,7 +135,7 @@
         </w:rPr>
         <w:t xml:space="preserve">GitHub: </w:t>
       </w:r>
-      <w:hyperlink w:history="1" r:id="rIdj-_ep2jjgw68b2_nld5-j">
+      <w:hyperlink w:history="1" r:id="rId-hhlym0aw1tw4eyrv4mds">
         <w:r>
           <w:rPr>
             <w:rFonts w:ascii="Calibri" w:cs="Calibri" w:eastAsia="Calibri" w:hAnsi="Calibri"/>
@@ -163,7 +163,7 @@
         </w:rPr>
         <w:t xml:space="preserve">LinkedIn: </w:t>
       </w:r>
-      <w:hyperlink w:history="1" r:id="rIdmb_uvxpliqjzhqnsjhpgt">
+      <w:hyperlink w:history="1" r:id="rId1lel47gs81b8lzior7qjv">
         <w:r>
           <w:rPr>
             <w:rFonts w:ascii="Calibri" w:cs="Calibri" w:eastAsia="Calibri" w:hAnsi="Calibri"/>
@@ -679,7 +679,7 @@
         </w:rPr>
         <w:t xml:space="preserve">GitHub: </w:t>
       </w:r>
-      <w:hyperlink w:history="1" r:id="rId6k7hescm_b7fva0d3upjs">
+      <w:hyperlink w:history="1" r:id="rIdey0oclr9zgmnn87c2khvh">
         <w:r>
           <w:rPr>
             <w:rFonts w:ascii="Calibri" w:cs="Calibri" w:eastAsia="Calibri" w:hAnsi="Calibri"/>
@@ -847,7 +847,7 @@
         </w:rPr>
         <w:t xml:space="preserve">GitHub: </w:t>
       </w:r>
-      <w:hyperlink w:history="1" r:id="rIdjxnc-h_vfktnlw_-d_fyo">
+      <w:hyperlink w:history="1" r:id="rIddocrjbscbqeprbyis1lhz">
         <w:r>
           <w:rPr>
             <w:rFonts w:ascii="Calibri" w:cs="Calibri" w:eastAsia="Calibri" w:hAnsi="Calibri"/>
@@ -1016,7 +1016,7 @@
         </w:rPr>
         <w:t xml:space="preserve">GitHub: </w:t>
       </w:r>
-      <w:hyperlink w:history="1" r:id="rIdyyb48rflw6gtoglfl2ie9">
+      <w:hyperlink w:history="1" r:id="rIdflxnyjgsyulejdo_aay1i">
         <w:r>
           <w:rPr>
             <w:rFonts w:ascii="Calibri" w:cs="Calibri" w:eastAsia="Calibri" w:hAnsi="Calibri"/>
@@ -1046,9 +1046,9 @@
           <w:sz w:val="21"/>
           <w:szCs w:val="21"/>
         </w:rPr>
-        <w:t xml:space="preserve">Live demo: </w:t>
-      </w:r>
-      <w:hyperlink w:history="1" r:id="rIda194bcvmmffva5pxfmtk0">
+        <w:t xml:space="preserve">Live site: </w:t>
+      </w:r>
+      <w:hyperlink w:history="1" r:id="rIdpaunyhmtcpekbzb3mg9xs">
         <w:r>
           <w:rPr>
             <w:rFonts w:ascii="Calibri" w:cs="Calibri" w:eastAsia="Calibri" w:hAnsi="Calibri"/>
@@ -1057,7 +1057,7 @@
             <w:szCs w:val="21"/>
             <w:u w:val="single"/>
           </w:rPr>
-          <w:t xml:space="preserve">taskify-frontend-ol07.onrender.com</w:t>
+          <w:t xml:space="preserve">taskify-marketplace.co.za</w:t>
         </w:r>
       </w:hyperlink>
     </w:p>
@@ -1196,7 +1196,7 @@
         </w:rPr>
         <w:t xml:space="preserve">GitHub: </w:t>
       </w:r>
-      <w:hyperlink w:history="1" r:id="rIddrgjkml1yiliqufxeiw89">
+      <w:hyperlink w:history="1" r:id="rIdnntj0latrnv-bgoqfwjre">
         <w:r>
           <w:rPr>
             <w:rFonts w:ascii="Calibri" w:cs="Calibri" w:eastAsia="Calibri" w:hAnsi="Calibri"/>

</xml_diff>